<commit_message>
Resume refresh Sep-2026: Whiteville-Coin job card, Senior titles, 4 live apps, current docx, regression tests
</commit_message>
<xml_diff>
--- a/public/files/stephanwardresume.docx
+++ b/public/files/stephanwardresume.docx
@@ -458,34 +458,44 @@
         </w:rPr>
         <w:t xml:space="preserve">Professional Bio: </w:t>
       </w:r>
-      <w:hyperlink r:id="rId6">
+      <w:hyperlink r:id="rId6" w:history="1">
         <w:r>
           <w:rPr>
+            <w:rStyle w:val="Hyperlink"/>
             <w:rFonts w:ascii="Calibri" w:hAnsi="Calibri" w:cs="Calibri"/>
-            <w:color w:val="0000FF"/>
-            <w:u w:val="single" w:color="0000FF"/>
           </w:rPr>
-          <w:t>https://stephanfward.wordpress.c</w:t>
+          <w:t>https://stephan-ward-bio-site.onrender.com/</w:t>
         </w:r>
       </w:hyperlink>
-      <w:hyperlink r:id="rId7">
+    </w:p>
+    <w:p>
+      <w:pPr>
+        <w:spacing w:after="11" w:line="259" w:lineRule="auto"/>
+        <w:ind w:left="-5"/>
+        <w:rPr>
+          <w:rFonts w:ascii="Calibri" w:hAnsi="Calibri" w:cs="Calibri"/>
+        </w:rPr>
+      </w:pPr>
+      <w:r>
+        <w:rPr>
+          <w:rFonts w:ascii="Calibri" w:hAnsi="Calibri" w:cs="Calibri"/>
+        </w:rPr>
+        <w:t xml:space="preserve">Portfolio: </w:t>
+      </w:r>
+      <w:hyperlink r:id="rId7" w:history="1">
         <w:r>
           <w:rPr>
-            <w:rFonts w:ascii="Calibri" w:hAnsi="Calibri" w:cs="Calibri"/>
-            <w:color w:val="0000FF"/>
-            <w:u w:val="single" w:color="0000FF"/>
+            <w:rStyle w:val="Hyperlink"/>
           </w:rPr>
-          <w:t>o</w:t>
+          <w:t>https://stephan-ward-bio-site.onrender.com/portfolio</w:t>
         </w:r>
       </w:hyperlink>
       <w:hyperlink r:id="rId8">
         <w:r>
           <w:rPr>
             <w:rFonts w:ascii="Calibri" w:hAnsi="Calibri" w:cs="Calibri"/>
-            <w:color w:val="0000FF"/>
-            <w:u w:val="single" w:color="0000FF"/>
           </w:rPr>
-          <w:t>m</w:t>
+          <w:t xml:space="preserve">  </w:t>
         </w:r>
       </w:hyperlink>
       <w:hyperlink r:id="rId9">
@@ -493,10 +503,33 @@
           <w:rPr>
             <w:rFonts w:ascii="Calibri" w:hAnsi="Calibri" w:cs="Calibri"/>
           </w:rPr>
-          <w:t xml:space="preserve">  </w:t>
+          <w:t xml:space="preserve"> </w:t>
         </w:r>
       </w:hyperlink>
+    </w:p>
+    <w:p>
+      <w:pPr>
+        <w:spacing w:after="6" w:line="259" w:lineRule="auto"/>
+        <w:ind w:left="0" w:firstLine="0"/>
+        <w:rPr>
+          <w:rFonts w:ascii="Calibri" w:hAnsi="Calibri" w:cs="Calibri"/>
+        </w:rPr>
+      </w:pPr>
+      <w:r>
+        <w:rPr>
+          <w:rFonts w:ascii="Calibri" w:hAnsi="Calibri" w:cs="Calibri"/>
+        </w:rPr>
+        <w:t>Github</w:t>
+      </w:r>
       <w:hyperlink r:id="rId10">
+        <w:r>
+          <w:rPr>
+            <w:rFonts w:ascii="Calibri" w:hAnsi="Calibri" w:cs="Calibri"/>
+          </w:rPr>
+          <w:t>:</w:t>
+        </w:r>
+      </w:hyperlink>
+      <w:hyperlink r:id="rId11">
         <w:r>
           <w:rPr>
             <w:rFonts w:ascii="Calibri" w:hAnsi="Calibri" w:cs="Calibri"/>
@@ -504,119 +537,7 @@
           <w:t xml:space="preserve"> </w:t>
         </w:r>
       </w:hyperlink>
-    </w:p>
-    <w:p>
-      <w:pPr>
-        <w:spacing w:after="11" w:line="259" w:lineRule="auto"/>
-        <w:ind w:left="-5"/>
-        <w:rPr>
-          <w:rFonts w:ascii="Calibri" w:hAnsi="Calibri" w:cs="Calibri"/>
-        </w:rPr>
-      </w:pPr>
-      <w:r>
-        <w:rPr>
-          <w:rFonts w:ascii="Calibri" w:hAnsi="Calibri" w:cs="Calibri"/>
-        </w:rPr>
-        <w:t xml:space="preserve">Portfolio: </w:t>
-      </w:r>
-      <w:hyperlink r:id="rId11">
-        <w:r>
-          <w:rPr>
-            <w:rFonts w:ascii="Calibri" w:hAnsi="Calibri" w:cs="Calibri"/>
-            <w:color w:val="0000FF"/>
-            <w:u w:val="single" w:color="0000FF"/>
-          </w:rPr>
-          <w:t>https://stephanfward.wordpress.com/projec</w:t>
-        </w:r>
-      </w:hyperlink>
       <w:hyperlink r:id="rId12">
-        <w:r>
-          <w:rPr>
-            <w:rFonts w:ascii="Calibri" w:hAnsi="Calibri" w:cs="Calibri"/>
-            <w:color w:val="0000FF"/>
-            <w:u w:val="single" w:color="0000FF"/>
-          </w:rPr>
-          <w:t>t</w:t>
-        </w:r>
-      </w:hyperlink>
-      <w:hyperlink r:id="rId13">
-        <w:r>
-          <w:rPr>
-            <w:rFonts w:ascii="Calibri" w:hAnsi="Calibri" w:cs="Calibri"/>
-            <w:color w:val="0000FF"/>
-            <w:u w:val="single" w:color="0000FF"/>
-          </w:rPr>
-          <w:t>s</w:t>
-        </w:r>
-      </w:hyperlink>
-      <w:hyperlink r:id="rId14">
-        <w:r>
-          <w:rPr>
-            <w:rFonts w:ascii="Calibri" w:hAnsi="Calibri" w:cs="Calibri"/>
-            <w:color w:val="0000FF"/>
-            <w:u w:val="single" w:color="0000FF"/>
-          </w:rPr>
-          <w:t>-</w:t>
-        </w:r>
-      </w:hyperlink>
-      <w:hyperlink r:id="rId15">
-        <w:r>
-          <w:rPr>
-            <w:rFonts w:ascii="Calibri" w:hAnsi="Calibri" w:cs="Calibri"/>
-            <w:color w:val="0000FF"/>
-            <w:u w:val="single" w:color="0000FF"/>
-          </w:rPr>
-          <w:t>2</w:t>
-        </w:r>
-      </w:hyperlink>
-      <w:hyperlink r:id="rId16">
-        <w:r>
-          <w:rPr>
-            <w:rFonts w:ascii="Calibri" w:hAnsi="Calibri" w:cs="Calibri"/>
-          </w:rPr>
-          <w:t xml:space="preserve">  </w:t>
-        </w:r>
-      </w:hyperlink>
-      <w:hyperlink r:id="rId17">
-        <w:r>
-          <w:rPr>
-            <w:rFonts w:ascii="Calibri" w:hAnsi="Calibri" w:cs="Calibri"/>
-          </w:rPr>
-          <w:t xml:space="preserve"> </w:t>
-        </w:r>
-      </w:hyperlink>
-    </w:p>
-    <w:p>
-      <w:pPr>
-        <w:spacing w:after="6" w:line="259" w:lineRule="auto"/>
-        <w:ind w:left="0" w:firstLine="0"/>
-        <w:rPr>
-          <w:rFonts w:ascii="Calibri" w:hAnsi="Calibri" w:cs="Calibri"/>
-        </w:rPr>
-      </w:pPr>
-      <w:r>
-        <w:rPr>
-          <w:rFonts w:ascii="Calibri" w:hAnsi="Calibri" w:cs="Calibri"/>
-        </w:rPr>
-        <w:t>Github</w:t>
-      </w:r>
-      <w:hyperlink r:id="rId18">
-        <w:r>
-          <w:rPr>
-            <w:rFonts w:ascii="Calibri" w:hAnsi="Calibri" w:cs="Calibri"/>
-          </w:rPr>
-          <w:t>:</w:t>
-        </w:r>
-      </w:hyperlink>
-      <w:hyperlink r:id="rId19">
-        <w:r>
-          <w:rPr>
-            <w:rFonts w:ascii="Calibri" w:hAnsi="Calibri" w:cs="Calibri"/>
-          </w:rPr>
-          <w:t xml:space="preserve"> </w:t>
-        </w:r>
-      </w:hyperlink>
-      <w:hyperlink r:id="rId20">
         <w:r>
           <w:rPr>
             <w:rFonts w:ascii="Calibri" w:hAnsi="Calibri" w:cs="Calibri"/>
@@ -626,7 +547,7 @@
           <w:t>https://github.com/StephanFWa</w:t>
         </w:r>
       </w:hyperlink>
-      <w:hyperlink r:id="rId21">
+      <w:hyperlink r:id="rId13">
         <w:r>
           <w:rPr>
             <w:rFonts w:ascii="Calibri" w:hAnsi="Calibri" w:cs="Calibri"/>
@@ -636,7 +557,7 @@
           <w:t>r</w:t>
         </w:r>
       </w:hyperlink>
-      <w:hyperlink r:id="rId22">
+      <w:hyperlink r:id="rId14">
         <w:r>
           <w:rPr>
             <w:rFonts w:ascii="Calibri" w:hAnsi="Calibri" w:cs="Calibri"/>
@@ -646,7 +567,7 @@
           <w:t>d</w:t>
         </w:r>
       </w:hyperlink>
-      <w:hyperlink r:id="rId23">
+      <w:hyperlink r:id="rId15">
         <w:r>
           <w:rPr>
             <w:rFonts w:ascii="Calibri" w:hAnsi="Calibri" w:cs="Calibri"/>
@@ -654,7 +575,7 @@
           <w:t xml:space="preserve">  </w:t>
         </w:r>
       </w:hyperlink>
-      <w:hyperlink r:id="rId24">
+      <w:hyperlink r:id="rId16">
         <w:r>
           <w:rPr>
             <w:rFonts w:ascii="Calibri" w:hAnsi="Calibri" w:cs="Calibri"/>
@@ -1124,7 +1045,7 @@
           <w:b/>
           <w:bCs/>
         </w:rPr>
-        <w:t>CEO</w:t>
+        <w:t xml:space="preserve">Senior </w:t>
       </w:r>
       <w:r>
         <w:rPr>
@@ -1132,15 +1053,26 @@
           <w:b/>
           <w:bCs/>
         </w:rPr>
-        <w:t xml:space="preserve"> &amp; </w:t>
-      </w:r>
+        <w:t xml:space="preserve">Software Engineer | </w:t>
+      </w:r>
+      <w:hyperlink r:id="rId17" w:history="1">
+        <w:r>
+          <w:rPr>
+            <w:rStyle w:val="Hyperlink"/>
+            <w:rFonts w:ascii="Calibri" w:hAnsi="Calibri" w:cs="Calibri"/>
+            <w:b/>
+            <w:bCs/>
+          </w:rPr>
+          <w:t>Whiteville-Coin</w:t>
+        </w:r>
+      </w:hyperlink>
       <w:r>
         <w:rPr>
           <w:rFonts w:ascii="Calibri" w:hAnsi="Calibri" w:cs="Calibri"/>
           <w:b/>
           <w:bCs/>
         </w:rPr>
-        <w:t>Software Engineer</w:t>
+        <w:t xml:space="preserve"> | </w:t>
       </w:r>
       <w:r>
         <w:rPr>
@@ -1148,9 +1080,172 @@
           <w:b/>
           <w:bCs/>
         </w:rPr>
+        <w:t>July</w:t>
+      </w:r>
+      <w:r>
+        <w:rPr>
+          <w:rFonts w:ascii="Calibri" w:hAnsi="Calibri" w:cs="Calibri"/>
+          <w:b/>
+          <w:bCs/>
+        </w:rPr>
+        <w:t xml:space="preserve"> 2026 – Present | Whiteville, NC – Remote  </w:t>
+      </w:r>
+    </w:p>
+    <w:p>
+      <w:pPr>
+        <w:spacing w:after="56" w:line="258" w:lineRule="auto"/>
+        <w:ind w:left="0" w:firstLine="0"/>
+        <w:rPr>
+          <w:rFonts w:ascii="Calibri" w:hAnsi="Calibri" w:cs="Calibri"/>
+          <w:b/>
+          <w:bCs/>
+        </w:rPr>
+      </w:pPr>
+    </w:p>
+    <w:p>
+      <w:pPr>
+        <w:pStyle w:val="ListParagraph"/>
+        <w:numPr>
+          <w:ilvl w:val="0"/>
+          <w:numId w:val="30"/>
+        </w:numPr>
+        <w:spacing w:after="56" w:line="258" w:lineRule="auto"/>
+        <w:jc w:val="both"/>
+        <w:rPr>
+          <w:rFonts w:ascii="Calibri" w:hAnsi="Calibri" w:cs="Calibri"/>
+        </w:rPr>
+      </w:pPr>
+      <w:r>
+        <w:rPr>
+          <w:rFonts w:ascii="Calibri" w:hAnsi="Calibri" w:cs="Calibri"/>
+        </w:rPr>
+        <w:t xml:space="preserve">     </w:t>
+      </w:r>
+      <w:r>
+        <w:rPr>
+          <w:rFonts w:ascii="Calibri" w:hAnsi="Calibri" w:cs="Calibri"/>
+        </w:rPr>
+        <w:t xml:space="preserve">  </w:t>
+      </w:r>
+      <w:r>
+        <w:rPr>
+          <w:rFonts w:ascii="Calibri" w:hAnsi="Calibri" w:cs="Calibri"/>
+        </w:rPr>
+        <w:t>Built a fully-functional community cryptocurrency platform with a fixed 210,000-coin supply and a live pricing oracle that averages the CoinGecko Top-50 USD prices every 60 seconds via SSE fan-out. Implemented a complete brokerage with Stripe checkout sessions, idempotent webhook settlement, and instant sell/withdraw logic priced at the live oracle rate with a 0.5% platform fee—operating in a clearly-labelled sandbox mode when live keys are absent. Delivered a dependency-free SVG real-time chart with 1D/1W/1M/6M/1Y/ALL ranges, hover tooltips, and seeded history, plus an admin console, user accounts with scrypt-hashed passwords and signed HttpOnly session cookies, and a full transaction ledger with P&amp;L tracking.</w:t>
+      </w:r>
+    </w:p>
+    <w:p>
+      <w:pPr>
+        <w:spacing w:after="56" w:line="258" w:lineRule="auto"/>
+        <w:ind w:left="0" w:firstLine="0"/>
+        <w:rPr>
+          <w:rFonts w:ascii="Calibri" w:hAnsi="Calibri" w:cs="Calibri"/>
+        </w:rPr>
+      </w:pPr>
+    </w:p>
+    <w:p>
+      <w:pPr>
+        <w:pStyle w:val="ListParagraph"/>
+        <w:numPr>
+          <w:ilvl w:val="0"/>
+          <w:numId w:val="30"/>
+        </w:numPr>
+        <w:spacing w:after="56" w:line="258" w:lineRule="auto"/>
+        <w:rPr>
+          <w:rFonts w:ascii="Calibri" w:hAnsi="Calibri" w:cs="Calibri"/>
+        </w:rPr>
+      </w:pPr>
+      <w:r>
+        <w:rPr>
+          <w:rFonts w:ascii="Calibri" w:hAnsi="Calibri" w:cs="Calibri"/>
+        </w:rPr>
+        <w:t xml:space="preserve">       </w:t>
+      </w:r>
+      <w:r>
+        <w:rPr>
+          <w:rFonts w:ascii="Calibri" w:hAnsi="Calibri" w:cs="Calibri"/>
+        </w:rPr>
+        <w:t>Architected a resilient data layer using SQLite with double-entry bookkeeping, atomic JSON writes, and a cloud backup system that pushes the database to a private GitHub repo every 5 minutes and restores it at boot—solving Render's free-tier filesystem wipe problem without paid persistent disks. Built a full authentication middleware stack (pageAuth, apiAuth, adminOnly, sameOrigin) and integrated pdfkit + nodemailer for automated annual tax report generation (PDF/CSV/JSON exports). Implemented a comprehensive SEO strategy with semantic HTML, per-page meta tags, canonical URLs, Open Graph/Twitter tags, generated sitemap.xml with hourly re-generation and search engine pinging, plus a clean-slug comparison hub with 301 redirects for legacy URLs, side-by-side tables, pros/cons, and JSON-LD structured data (Product, FAQPage, BreadcrumbList).</w:t>
+      </w:r>
+    </w:p>
+    <w:p>
+      <w:pPr>
+        <w:spacing w:after="56" w:line="258" w:lineRule="auto"/>
+        <w:ind w:left="0" w:firstLine="0"/>
+        <w:rPr>
+          <w:rFonts w:ascii="Calibri" w:hAnsi="Calibri" w:cs="Calibri"/>
+        </w:rPr>
+      </w:pPr>
+    </w:p>
+    <w:p>
+      <w:pPr>
+        <w:pStyle w:val="ListParagraph"/>
+        <w:numPr>
+          <w:ilvl w:val="0"/>
+          <w:numId w:val="30"/>
+        </w:numPr>
+        <w:spacing w:after="56" w:line="258" w:lineRule="auto"/>
+        <w:rPr>
+          <w:rFonts w:ascii="Calibri" w:hAnsi="Calibri" w:cs="Calibri"/>
+        </w:rPr>
+      </w:pPr>
+      <w:r>
+        <w:rPr>
+          <w:rFonts w:ascii="Calibri" w:hAnsi="Calibri" w:cs="Calibri"/>
+        </w:rPr>
+        <w:t xml:space="preserve">       </w:t>
+      </w:r>
+      <w:r>
+        <w:rPr>
+          <w:rFonts w:ascii="Calibri" w:hAnsi="Calibri" w:cs="Calibri"/>
+        </w:rPr>
+        <w:t>Delivered a smart contract (WhitevilleCoin.sol) alongside a full regulatory compliance framework covering US federal classification, MICA regulatory classification, tokenomics audit, AML program templates, KYC vendor evaluation, incident response runbooks, and consumer/marketing compliance documentation—positioning the project for potential CoinGecko listing and regulatory readiness. Maintained a robust test suite covering accounting logic and admin compliance, and structured the codebase with clear separation of concerns (config, util, store, auth, engine, brokerage, backup) plus a build/deploy script pipeline, demonstrating end-to-end ownership from smart contract to web app to compliance documentation.</w:t>
+      </w:r>
+    </w:p>
+    <w:p>
+      <w:pPr>
+        <w:spacing w:after="56" w:line="258" w:lineRule="auto"/>
+        <w:ind w:left="0" w:firstLine="0"/>
+        <w:rPr>
+          <w:rFonts w:ascii="Calibri" w:hAnsi="Calibri" w:cs="Calibri"/>
+        </w:rPr>
+      </w:pPr>
+    </w:p>
+    <w:p>
+      <w:pPr>
+        <w:spacing w:after="56" w:line="258" w:lineRule="auto"/>
+        <w:ind w:left="0" w:firstLine="0"/>
+        <w:rPr>
+          <w:rFonts w:ascii="Calibri" w:hAnsi="Calibri" w:cs="Calibri"/>
+          <w:b/>
+          <w:bCs/>
+        </w:rPr>
+      </w:pPr>
+      <w:r>
+        <w:rPr>
+          <w:rFonts w:ascii="Calibri" w:hAnsi="Calibri" w:cs="Calibri"/>
+          <w:b/>
+          <w:bCs/>
+        </w:rPr>
+        <w:t xml:space="preserve">Senior </w:t>
+      </w:r>
+      <w:r>
+        <w:rPr>
+          <w:rFonts w:ascii="Calibri" w:hAnsi="Calibri" w:cs="Calibri"/>
+          <w:b/>
+          <w:bCs/>
+        </w:rPr>
+        <w:t>Software Engineer</w:t>
+      </w:r>
+      <w:r>
+        <w:rPr>
+          <w:rFonts w:ascii="Calibri" w:hAnsi="Calibri" w:cs="Calibri"/>
+          <w:b/>
+          <w:bCs/>
+        </w:rPr>
         <w:t xml:space="preserve"> | </w:t>
       </w:r>
-      <w:hyperlink r:id="rId25" w:history="1">
+      <w:hyperlink r:id="rId18" w:history="1">
         <w:r>
           <w:rPr>
             <w:rStyle w:val="Hyperlink"/>
@@ -1183,7 +1278,7 @@
           <w:b/>
           <w:bCs/>
         </w:rPr>
-        <w:t>Feb</w:t>
+        <w:t>Jan</w:t>
       </w:r>
       <w:r>
         <w:rPr>
@@ -1191,7 +1286,7 @@
           <w:b/>
           <w:bCs/>
         </w:rPr>
-        <w:t>. 202</w:t>
+        <w:t xml:space="preserve"> 202</w:t>
       </w:r>
       <w:r>
         <w:rPr>
@@ -1215,7 +1310,7 @@
           <w:b/>
           <w:bCs/>
         </w:rPr>
-        <w:t>Present</w:t>
+        <w:t>July 2026</w:t>
       </w:r>
       <w:r>
         <w:rPr>
@@ -1335,7 +1430,7 @@
           <w:b/>
           <w:bCs/>
         </w:rPr>
-        <w:t>CEO</w:t>
+        <w:t xml:space="preserve">Senior </w:t>
       </w:r>
       <w:r>
         <w:rPr>
@@ -1343,7 +1438,7 @@
           <w:b/>
           <w:bCs/>
         </w:rPr>
-        <w:t xml:space="preserve"> &amp; Software</w:t>
+        <w:t>Software</w:t>
       </w:r>
       <w:r>
         <w:rPr>
@@ -1369,7 +1464,7 @@
         </w:rPr>
         <w:t xml:space="preserve">| </w:t>
       </w:r>
-      <w:hyperlink r:id="rId26" w:history="1">
+      <w:hyperlink r:id="rId19" w:history="1">
         <w:r>
           <w:rPr>
             <w:rStyle w:val="Hyperlink"/>
@@ -1388,7 +1483,7 @@
         </w:rPr>
         <w:t xml:space="preserve"> and</w:t>
       </w:r>
-      <w:hyperlink r:id="rId27" w:history="1">
+      <w:hyperlink r:id="rId20" w:history="1">
         <w:r>
           <w:rPr>
             <w:rStyle w:val="Hyperlink"/>
@@ -1429,7 +1524,7 @@
           <w:b/>
           <w:bCs/>
         </w:rPr>
-        <w:t xml:space="preserve">. 2025 – </w:t>
+        <w:t>. 202</w:t>
       </w:r>
       <w:r>
         <w:rPr>
@@ -1437,7 +1532,31 @@
           <w:b/>
           <w:bCs/>
         </w:rPr>
-        <w:t>Present</w:t>
+        <w:t>6</w:t>
+      </w:r>
+      <w:r>
+        <w:rPr>
+          <w:rFonts w:ascii="Calibri" w:hAnsi="Calibri" w:cs="Calibri"/>
+          <w:b/>
+          <w:bCs/>
+        </w:rPr>
+        <w:t xml:space="preserve"> – </w:t>
+      </w:r>
+      <w:r>
+        <w:rPr>
+          <w:rFonts w:ascii="Calibri" w:hAnsi="Calibri" w:cs="Calibri"/>
+          <w:b/>
+          <w:bCs/>
+        </w:rPr>
+        <w:t>July</w:t>
+      </w:r>
+      <w:r>
+        <w:rPr>
+          <w:rFonts w:ascii="Calibri" w:hAnsi="Calibri" w:cs="Calibri"/>
+          <w:b/>
+          <w:bCs/>
+        </w:rPr>
+        <w:t xml:space="preserve"> 2026</w:t>
       </w:r>
       <w:r>
         <w:rPr>
@@ -1603,7 +1722,6 @@
         <w:rPr>
           <w:rFonts w:ascii="Calibri" w:hAnsi="Calibri" w:cs="Calibri"/>
         </w:rPr>
-        <w:lastRenderedPageBreak/>
         <w:t>Integrated secure payment processing and user authentication for a seamless and protected transaction experience.</w:t>
       </w:r>
     </w:p>
@@ -1633,6 +1751,7 @@
         <w:rPr>
           <w:rFonts w:ascii="Calibri" w:hAnsi="Calibri" w:cs="Calibri"/>
         </w:rPr>
+        <w:lastRenderedPageBreak/>
         <w:t>Ensured compliance with state-specific legal standards by structuring document generation logic to meet diverse jurisdictional requirements.</w:t>
       </w:r>
     </w:p>
@@ -1855,7 +1974,6 @@
         <w:rPr>
           <w:rFonts w:ascii="Calibri" w:eastAsia="Calibri" w:hAnsi="Calibri" w:cs="Calibri"/>
         </w:rPr>
-        <w:lastRenderedPageBreak/>
         <w:t xml:space="preserve"> </w:t>
       </w:r>
       <w:r>
@@ -1877,6 +1995,7 @@
         <w:rPr>
           <w:rFonts w:ascii="Calibri" w:hAnsi="Calibri" w:cs="Calibri"/>
         </w:rPr>
+        <w:lastRenderedPageBreak/>
         <w:t xml:space="preserve">Senior Frontend Developer - Contract | MedSys – Baylor Health| Mar. 2024 – May. 2024 | Plano, TX – Remote  </w:t>
       </w:r>
     </w:p>
@@ -2180,14 +2299,7 @@
         <w:rPr>
           <w:rFonts w:ascii="Calibri" w:hAnsi="Calibri" w:cs="Calibri"/>
         </w:rPr>
-        <w:t xml:space="preserve">ed Standard Operating Procedures </w:t>
-      </w:r>
-      <w:r>
-        <w:rPr>
-          <w:rFonts w:ascii="Calibri" w:hAnsi="Calibri" w:cs="Calibri"/>
-        </w:rPr>
-        <w:lastRenderedPageBreak/>
-        <w:t xml:space="preserve">(SOPs). This initiative reduced the average time required from 1 to 2 days to just two hours, resulting in a 75% decrease in local deployment set up time.     </w:t>
+        <w:t xml:space="preserve">ed Standard Operating Procedures (SOPs). This initiative reduced the average time required from 1 to 2 days to just two hours, resulting in a 75% decrease in local deployment set up time.     </w:t>
       </w:r>
     </w:p>
     <w:p>
@@ -2444,8 +2556,14 @@
         <w:rPr>
           <w:rFonts w:ascii="Calibri" w:hAnsi="Calibri" w:cs="Calibri"/>
         </w:rPr>
+        <w:t xml:space="preserve">Developed robust SaaS platforms catering to diverse industries such as health information, banking, mining, oil and gas, real estate, radio, networking, and property </w:t>
+      </w:r>
+      <w:r>
+        <w:rPr>
+          <w:rFonts w:ascii="Calibri" w:hAnsi="Calibri" w:cs="Calibri"/>
+        </w:rPr>
         <w:lastRenderedPageBreak/>
-        <w:t xml:space="preserve">Developed robust SaaS platforms catering to diverse industries such as health information, banking, mining, oil and gas, real estate, radio, networking, and property management.  Leveraged industry-specific best practices and technologies to deliver scalable and secure solutions that addressed clients’ unique needs and drove business growth. </w:t>
+        <w:t xml:space="preserve">management.  Leveraged industry-specific best practices and technologies to deliver scalable and secure solutions that addressed clients’ unique needs and drove business growth. </w:t>
       </w:r>
     </w:p>
     <w:p>
@@ -2749,8 +2867,14 @@
         <w:rPr>
           <w:rFonts w:ascii="Calibri" w:hAnsi="Calibri" w:cs="Calibri"/>
         </w:rPr>
+        <w:t xml:space="preserve">Conducted through analysis of business cases and performed vendor evaluations, assessing their suitability and alignment with the company’s requirements and goals. Leveraged </w:t>
+      </w:r>
+      <w:r>
+        <w:rPr>
+          <w:rFonts w:ascii="Calibri" w:hAnsi="Calibri" w:cs="Calibri"/>
+        </w:rPr>
         <w:lastRenderedPageBreak/>
-        <w:t>Conducted through analysis of business cases and performed vendor evaluations, assessing their suitability and alignment with the company’s requirements and goals. Leveraged insights and market intelligence to make informed decisions and select strategic partners, driving successful collaborations and achieving business objectives.</w:t>
+        <w:t>insights and market intelligence to make informed decisions and select strategic partners, driving successful collaborations and achieving business objectives.</w:t>
       </w:r>
     </w:p>
     <w:p>
@@ -5218,6 +5342,119 @@
     </w:lvl>
   </w:abstractNum>
   <w:abstractNum w:abstractNumId="15" w15:restartNumberingAfterBreak="0">
+    <w:nsid w:val="501A4AF4"/>
+    <w:multiLevelType w:val="hybridMultilevel"/>
+    <w:tmpl w:val="5F5CDA14"/>
+    <w:lvl w:ilvl="0" w:tplc="04090001">
+      <w:start w:val="1"/>
+      <w:numFmt w:val="bullet"/>
+      <w:lvlText w:val=""/>
+      <w:lvlJc w:val="left"/>
+      <w:pPr>
+        <w:ind w:left="360" w:hanging="360"/>
+      </w:pPr>
+      <w:rPr>
+        <w:rFonts w:ascii="Symbol" w:hAnsi="Symbol" w:hint="default"/>
+      </w:rPr>
+    </w:lvl>
+    <w:lvl w:ilvl="1" w:tplc="04090003" w:tentative="1">
+      <w:start w:val="1"/>
+      <w:numFmt w:val="bullet"/>
+      <w:lvlText w:val="o"/>
+      <w:lvlJc w:val="left"/>
+      <w:pPr>
+        <w:ind w:left="1080" w:hanging="360"/>
+      </w:pPr>
+      <w:rPr>
+        <w:rFonts w:ascii="Courier New" w:hAnsi="Courier New" w:cs="Courier New" w:hint="default"/>
+      </w:rPr>
+    </w:lvl>
+    <w:lvl w:ilvl="2" w:tplc="04090005" w:tentative="1">
+      <w:start w:val="1"/>
+      <w:numFmt w:val="bullet"/>
+      <w:lvlText w:val=""/>
+      <w:lvlJc w:val="left"/>
+      <w:pPr>
+        <w:ind w:left="1800" w:hanging="360"/>
+      </w:pPr>
+      <w:rPr>
+        <w:rFonts w:ascii="Wingdings" w:hAnsi="Wingdings" w:hint="default"/>
+      </w:rPr>
+    </w:lvl>
+    <w:lvl w:ilvl="3" w:tplc="04090001" w:tentative="1">
+      <w:start w:val="1"/>
+      <w:numFmt w:val="bullet"/>
+      <w:lvlText w:val=""/>
+      <w:lvlJc w:val="left"/>
+      <w:pPr>
+        <w:ind w:left="2520" w:hanging="360"/>
+      </w:pPr>
+      <w:rPr>
+        <w:rFonts w:ascii="Symbol" w:hAnsi="Symbol" w:hint="default"/>
+      </w:rPr>
+    </w:lvl>
+    <w:lvl w:ilvl="4" w:tplc="04090003" w:tentative="1">
+      <w:start w:val="1"/>
+      <w:numFmt w:val="bullet"/>
+      <w:lvlText w:val="o"/>
+      <w:lvlJc w:val="left"/>
+      <w:pPr>
+        <w:ind w:left="3240" w:hanging="360"/>
+      </w:pPr>
+      <w:rPr>
+        <w:rFonts w:ascii="Courier New" w:hAnsi="Courier New" w:cs="Courier New" w:hint="default"/>
+      </w:rPr>
+    </w:lvl>
+    <w:lvl w:ilvl="5" w:tplc="04090005" w:tentative="1">
+      <w:start w:val="1"/>
+      <w:numFmt w:val="bullet"/>
+      <w:lvlText w:val=""/>
+      <w:lvlJc w:val="left"/>
+      <w:pPr>
+        <w:ind w:left="3960" w:hanging="360"/>
+      </w:pPr>
+      <w:rPr>
+        <w:rFonts w:ascii="Wingdings" w:hAnsi="Wingdings" w:hint="default"/>
+      </w:rPr>
+    </w:lvl>
+    <w:lvl w:ilvl="6" w:tplc="04090001" w:tentative="1">
+      <w:start w:val="1"/>
+      <w:numFmt w:val="bullet"/>
+      <w:lvlText w:val=""/>
+      <w:lvlJc w:val="left"/>
+      <w:pPr>
+        <w:ind w:left="4680" w:hanging="360"/>
+      </w:pPr>
+      <w:rPr>
+        <w:rFonts w:ascii="Symbol" w:hAnsi="Symbol" w:hint="default"/>
+      </w:rPr>
+    </w:lvl>
+    <w:lvl w:ilvl="7" w:tplc="04090003" w:tentative="1">
+      <w:start w:val="1"/>
+      <w:numFmt w:val="bullet"/>
+      <w:lvlText w:val="o"/>
+      <w:lvlJc w:val="left"/>
+      <w:pPr>
+        <w:ind w:left="5400" w:hanging="360"/>
+      </w:pPr>
+      <w:rPr>
+        <w:rFonts w:ascii="Courier New" w:hAnsi="Courier New" w:cs="Courier New" w:hint="default"/>
+      </w:rPr>
+    </w:lvl>
+    <w:lvl w:ilvl="8" w:tplc="04090005" w:tentative="1">
+      <w:start w:val="1"/>
+      <w:numFmt w:val="bullet"/>
+      <w:lvlText w:val=""/>
+      <w:lvlJc w:val="left"/>
+      <w:pPr>
+        <w:ind w:left="6120" w:hanging="360"/>
+      </w:pPr>
+      <w:rPr>
+        <w:rFonts w:ascii="Wingdings" w:hAnsi="Wingdings" w:hint="default"/>
+      </w:rPr>
+    </w:lvl>
+  </w:abstractNum>
+  <w:abstractNum w:abstractNumId="16" w15:restartNumberingAfterBreak="0">
     <w:nsid w:val="50B14E9C"/>
     <w:multiLevelType w:val="hybridMultilevel"/>
     <w:tmpl w:val="136A1D76"/>
@@ -5341,7 +5578,7 @@
       </w:rPr>
     </w:lvl>
   </w:abstractNum>
-  <w:abstractNum w:abstractNumId="16" w15:restartNumberingAfterBreak="0">
+  <w:abstractNum w:abstractNumId="17" w15:restartNumberingAfterBreak="0">
     <w:nsid w:val="574F28B1"/>
     <w:multiLevelType w:val="hybridMultilevel"/>
     <w:tmpl w:val="541AF466"/>
@@ -5465,7 +5702,7 @@
       </w:rPr>
     </w:lvl>
   </w:abstractNum>
-  <w:abstractNum w:abstractNumId="17" w15:restartNumberingAfterBreak="0">
+  <w:abstractNum w:abstractNumId="18" w15:restartNumberingAfterBreak="0">
     <w:nsid w:val="5757789A"/>
     <w:multiLevelType w:val="hybridMultilevel"/>
     <w:tmpl w:val="3C945B48"/>
@@ -5677,7 +5914,7 @@
       </w:rPr>
     </w:lvl>
   </w:abstractNum>
-  <w:abstractNum w:abstractNumId="18" w15:restartNumberingAfterBreak="0">
+  <w:abstractNum w:abstractNumId="19" w15:restartNumberingAfterBreak="0">
     <w:nsid w:val="5903203B"/>
     <w:multiLevelType w:val="hybridMultilevel"/>
     <w:tmpl w:val="3A5C57C8"/>
@@ -5889,7 +6126,7 @@
       </w:rPr>
     </w:lvl>
   </w:abstractNum>
-  <w:abstractNum w:abstractNumId="19" w15:restartNumberingAfterBreak="0">
+  <w:abstractNum w:abstractNumId="20" w15:restartNumberingAfterBreak="0">
     <w:nsid w:val="59305FCD"/>
     <w:multiLevelType w:val="hybridMultilevel"/>
     <w:tmpl w:val="023407FA"/>
@@ -6011,7 +6248,7 @@
       </w:rPr>
     </w:lvl>
   </w:abstractNum>
-  <w:abstractNum w:abstractNumId="20" w15:restartNumberingAfterBreak="0">
+  <w:abstractNum w:abstractNumId="21" w15:restartNumberingAfterBreak="0">
     <w:nsid w:val="5FE06809"/>
     <w:multiLevelType w:val="hybridMultilevel"/>
     <w:tmpl w:val="00F633DA"/>
@@ -6124,7 +6361,7 @@
       </w:rPr>
     </w:lvl>
   </w:abstractNum>
-  <w:abstractNum w:abstractNumId="21" w15:restartNumberingAfterBreak="0">
+  <w:abstractNum w:abstractNumId="22" w15:restartNumberingAfterBreak="0">
     <w:nsid w:val="667E4483"/>
     <w:multiLevelType w:val="hybridMultilevel"/>
     <w:tmpl w:val="51FC7FDC"/>
@@ -6248,7 +6485,7 @@
       </w:rPr>
     </w:lvl>
   </w:abstractNum>
-  <w:abstractNum w:abstractNumId="22" w15:restartNumberingAfterBreak="0">
+  <w:abstractNum w:abstractNumId="23" w15:restartNumberingAfterBreak="0">
     <w:nsid w:val="66BD294F"/>
     <w:multiLevelType w:val="hybridMultilevel"/>
     <w:tmpl w:val="A47836EC"/>
@@ -6361,7 +6598,7 @@
       </w:rPr>
     </w:lvl>
   </w:abstractNum>
-  <w:abstractNum w:abstractNumId="23" w15:restartNumberingAfterBreak="0">
+  <w:abstractNum w:abstractNumId="24" w15:restartNumberingAfterBreak="0">
     <w:nsid w:val="699723B7"/>
     <w:multiLevelType w:val="hybridMultilevel"/>
     <w:tmpl w:val="A864B280"/>
@@ -6485,7 +6722,7 @@
       </w:rPr>
     </w:lvl>
   </w:abstractNum>
-  <w:abstractNum w:abstractNumId="24" w15:restartNumberingAfterBreak="0">
+  <w:abstractNum w:abstractNumId="25" w15:restartNumberingAfterBreak="0">
     <w:nsid w:val="6BD2159A"/>
     <w:multiLevelType w:val="hybridMultilevel"/>
     <w:tmpl w:val="12B040F8"/>
@@ -6607,7 +6844,7 @@
       </w:rPr>
     </w:lvl>
   </w:abstractNum>
-  <w:abstractNum w:abstractNumId="25" w15:restartNumberingAfterBreak="0">
+  <w:abstractNum w:abstractNumId="26" w15:restartNumberingAfterBreak="0">
     <w:nsid w:val="6DD67A2A"/>
     <w:multiLevelType w:val="hybridMultilevel"/>
     <w:tmpl w:val="D47E77B6"/>
@@ -6720,7 +6957,7 @@
       </w:rPr>
     </w:lvl>
   </w:abstractNum>
-  <w:abstractNum w:abstractNumId="26" w15:restartNumberingAfterBreak="0">
+  <w:abstractNum w:abstractNumId="27" w15:restartNumberingAfterBreak="0">
     <w:nsid w:val="6F83355C"/>
     <w:multiLevelType w:val="hybridMultilevel"/>
     <w:tmpl w:val="A6D85298"/>
@@ -6833,7 +7070,7 @@
       </w:rPr>
     </w:lvl>
   </w:abstractNum>
-  <w:abstractNum w:abstractNumId="27" w15:restartNumberingAfterBreak="0">
+  <w:abstractNum w:abstractNumId="28" w15:restartNumberingAfterBreak="0">
     <w:nsid w:val="72EB045B"/>
     <w:multiLevelType w:val="hybridMultilevel"/>
     <w:tmpl w:val="84A634F2"/>
@@ -6957,7 +7194,7 @@
       </w:rPr>
     </w:lvl>
   </w:abstractNum>
-  <w:abstractNum w:abstractNumId="28" w15:restartNumberingAfterBreak="0">
+  <w:abstractNum w:abstractNumId="29" w15:restartNumberingAfterBreak="0">
     <w:nsid w:val="7DDA67C7"/>
     <w:multiLevelType w:val="hybridMultilevel"/>
     <w:tmpl w:val="100611D6"/>
@@ -7082,10 +7319,10 @@
     </w:lvl>
   </w:abstractNum>
   <w:num w:numId="1" w16cid:durableId="791750086">
-    <w:abstractNumId w:val="17"/>
+    <w:abstractNumId w:val="18"/>
   </w:num>
   <w:num w:numId="2" w16cid:durableId="1621372164">
-    <w:abstractNumId w:val="18"/>
+    <w:abstractNumId w:val="19"/>
   </w:num>
   <w:num w:numId="3" w16cid:durableId="2133011841">
     <w:abstractNumId w:val="1"/>
@@ -7097,22 +7334,22 @@
     <w:abstractNumId w:val="9"/>
   </w:num>
   <w:num w:numId="6" w16cid:durableId="1431387095">
-    <w:abstractNumId w:val="25"/>
+    <w:abstractNumId w:val="26"/>
   </w:num>
   <w:num w:numId="7" w16cid:durableId="635796930">
     <w:abstractNumId w:val="13"/>
   </w:num>
   <w:num w:numId="8" w16cid:durableId="327172769">
-    <w:abstractNumId w:val="21"/>
+    <w:abstractNumId w:val="22"/>
   </w:num>
   <w:num w:numId="9" w16cid:durableId="1355109764">
-    <w:abstractNumId w:val="27"/>
+    <w:abstractNumId w:val="28"/>
   </w:num>
   <w:num w:numId="10" w16cid:durableId="1133183180">
     <w:abstractNumId w:val="5"/>
   </w:num>
   <w:num w:numId="11" w16cid:durableId="635986825">
-    <w:abstractNumId w:val="16"/>
+    <w:abstractNumId w:val="17"/>
   </w:num>
   <w:num w:numId="12" w16cid:durableId="1580214325">
     <w:abstractNumId w:val="8"/>
@@ -7121,7 +7358,7 @@
     <w:abstractNumId w:val="11"/>
   </w:num>
   <w:num w:numId="14" w16cid:durableId="528756991">
-    <w:abstractNumId w:val="23"/>
+    <w:abstractNumId w:val="24"/>
   </w:num>
   <w:num w:numId="15" w16cid:durableId="89399382">
     <w:abstractNumId w:val="14"/>
@@ -7130,13 +7367,13 @@
     <w:abstractNumId w:val="4"/>
   </w:num>
   <w:num w:numId="17" w16cid:durableId="1200363706">
-    <w:abstractNumId w:val="15"/>
+    <w:abstractNumId w:val="16"/>
   </w:num>
   <w:num w:numId="18" w16cid:durableId="1139224669">
     <w:abstractNumId w:val="2"/>
   </w:num>
   <w:num w:numId="19" w16cid:durableId="1549144020">
-    <w:abstractNumId w:val="28"/>
+    <w:abstractNumId w:val="29"/>
   </w:num>
   <w:num w:numId="20" w16cid:durableId="545333369">
     <w:abstractNumId w:val="0"/>
@@ -7148,25 +7385,28 @@
     <w:abstractNumId w:val="3"/>
   </w:num>
   <w:num w:numId="23" w16cid:durableId="2106730494">
-    <w:abstractNumId w:val="26"/>
+    <w:abstractNumId w:val="27"/>
   </w:num>
   <w:num w:numId="24" w16cid:durableId="61029011">
-    <w:abstractNumId w:val="20"/>
+    <w:abstractNumId w:val="21"/>
   </w:num>
   <w:num w:numId="25" w16cid:durableId="1047686309">
     <w:abstractNumId w:val="7"/>
   </w:num>
   <w:num w:numId="26" w16cid:durableId="622662636">
-    <w:abstractNumId w:val="22"/>
+    <w:abstractNumId w:val="23"/>
   </w:num>
   <w:num w:numId="27" w16cid:durableId="2004815644">
-    <w:abstractNumId w:val="19"/>
+    <w:abstractNumId w:val="20"/>
   </w:num>
   <w:num w:numId="28" w16cid:durableId="615988320">
-    <w:abstractNumId w:val="24"/>
+    <w:abstractNumId w:val="25"/>
   </w:num>
   <w:num w:numId="29" w16cid:durableId="385031554">
     <w:abstractNumId w:val="12"/>
+  </w:num>
+  <w:num w:numId="30" w16cid:durableId="2140030245">
+    <w:abstractNumId w:val="15"/>
   </w:num>
 </w:numbering>
 </file>

</xml_diff>